<commit_message>
mise a jour docs
</commit_message>
<xml_diff>
--- a/docs/P_OO_MartinIvliev_Rapport.docx
+++ b/docs/P_OO_MartinIvliev_Rapport.docx
@@ -123,7 +123,7 @@
         <w:t>Table des matières</w:t>
       </w:r>
     </w:p>
-    <w:p xmlns:wp14="http://schemas.microsoft.com/office/word/2010/wordml" wp14:textId="2947FAFF">
+    <w:p xmlns:wp14="http://schemas.microsoft.com/office/word/2010/wordml" wp14:textId="06586DD3">
       <w:pPr>
         <w:pStyle w:val="TM10"/>
         <w:tabs>
@@ -144,7 +144,7 @@
         <w:fldChar w:fldCharType="begin"/>
       </w:r>
       <w:r>
-        <w:instrText xml:space="preserve">HYPERLINK  \l  "_Toc1233774730" </w:instrText>
+        <w:instrText xml:space="preserve">HYPERLINK  \l  "_Toc1543168939" </w:instrText>
       </w:r>
       <w:r>
         <w:fldChar w:fldCharType="separate"/>
@@ -167,7 +167,7 @@
         <w:fldChar w:fldCharType="begin"/>
       </w:r>
       <w:r>
-        <w:instrText xml:space="preserve">PAGEREF _Toc1233774730 \h</w:instrText>
+        <w:instrText xml:space="preserve">PAGEREF _Toc1543168939 \h</w:instrText>
       </w:r>
       <w:r>
         <w:fldChar w:fldCharType="separate"/>
@@ -183,7 +183,7 @@
         <w:fldChar w:fldCharType="end"/>
       </w:r>
     </w:p>
-    <w:p xmlns:wp14="http://schemas.microsoft.com/office/word/2010/wordml" wp14:textId="59102368">
+    <w:p xmlns:wp14="http://schemas.microsoft.com/office/word/2010/wordml" wp14:textId="46B0B3FD">
       <w:pPr>
         <w:pStyle w:val="TM2"/>
         <w:tabs>
@@ -195,7 +195,7 @@
         <w:fldChar w:fldCharType="begin"/>
       </w:r>
       <w:r>
-        <w:instrText xml:space="preserve">HYPERLINK  \l  "_Toc208587097" </w:instrText>
+        <w:instrText xml:space="preserve">HYPERLINK  \l  "_Toc1658641749" </w:instrText>
       </w:r>
       <w:r>
         <w:fldChar w:fldCharType="separate"/>
@@ -218,7 +218,7 @@
         <w:fldChar w:fldCharType="begin"/>
       </w:r>
       <w:r>
-        <w:instrText xml:space="preserve">PAGEREF _Toc208587097 \h</w:instrText>
+        <w:instrText xml:space="preserve">PAGEREF _Toc1658641749 \h</w:instrText>
       </w:r>
       <w:r>
         <w:fldChar w:fldCharType="separate"/>
@@ -234,7 +234,7 @@
         <w:fldChar w:fldCharType="end"/>
       </w:r>
     </w:p>
-    <w:p xmlns:wp14="http://schemas.microsoft.com/office/word/2010/wordml" wp14:textId="4B067847">
+    <w:p xmlns:wp14="http://schemas.microsoft.com/office/word/2010/wordml" wp14:textId="6F064AF8">
       <w:pPr>
         <w:pStyle w:val="TM2"/>
         <w:tabs>
@@ -246,7 +246,7 @@
         <w:fldChar w:fldCharType="begin"/>
       </w:r>
       <w:r>
-        <w:instrText xml:space="preserve">HYPERLINK  \l  "_Toc1799430099" </w:instrText>
+        <w:instrText xml:space="preserve">HYPERLINK  \l  "_Toc2109183303" </w:instrText>
       </w:r>
       <w:r>
         <w:fldChar w:fldCharType="separate"/>
@@ -269,7 +269,7 @@
         <w:fldChar w:fldCharType="begin"/>
       </w:r>
       <w:r>
-        <w:instrText xml:space="preserve">PAGEREF _Toc1799430099 \h</w:instrText>
+        <w:instrText xml:space="preserve">PAGEREF _Toc2109183303 \h</w:instrText>
       </w:r>
       <w:r>
         <w:fldChar w:fldCharType="separate"/>
@@ -285,7 +285,7 @@
         <w:fldChar w:fldCharType="end"/>
       </w:r>
     </w:p>
-    <w:p xmlns:wp14="http://schemas.microsoft.com/office/word/2010/wordml" wp14:textId="2FC4E990">
+    <w:p xmlns:wp14="http://schemas.microsoft.com/office/word/2010/wordml" wp14:textId="10FC33A8">
       <w:pPr>
         <w:pStyle w:val="TM10"/>
         <w:tabs>
@@ -297,7 +297,7 @@
         <w:fldChar w:fldCharType="begin"/>
       </w:r>
       <w:r>
-        <w:instrText xml:space="preserve">HYPERLINK  \l  "_Toc358953706" </w:instrText>
+        <w:instrText xml:space="preserve">HYPERLINK  \l  "_Toc179857693" </w:instrText>
       </w:r>
       <w:r>
         <w:fldChar w:fldCharType="separate"/>
@@ -320,7 +320,7 @@
         <w:fldChar w:fldCharType="begin"/>
       </w:r>
       <w:r>
-        <w:instrText xml:space="preserve">PAGEREF _Toc358953706 \h</w:instrText>
+        <w:instrText xml:space="preserve">PAGEREF _Toc179857693 \h</w:instrText>
       </w:r>
       <w:r>
         <w:fldChar w:fldCharType="separate"/>
@@ -336,7 +336,7 @@
         <w:fldChar w:fldCharType="end"/>
       </w:r>
     </w:p>
-    <w:p xmlns:wp14="http://schemas.microsoft.com/office/word/2010/wordml" wp14:textId="3B4B4920">
+    <w:p xmlns:wp14="http://schemas.microsoft.com/office/word/2010/wordml" wp14:textId="4B0716AA">
       <w:pPr>
         <w:pStyle w:val="TM10"/>
         <w:tabs>
@@ -348,7 +348,7 @@
         <w:fldChar w:fldCharType="begin"/>
       </w:r>
       <w:r>
-        <w:instrText xml:space="preserve">HYPERLINK  \l  "_Toc206092768" </w:instrText>
+        <w:instrText xml:space="preserve">HYPERLINK  \l  "_Toc1275241652" </w:instrText>
       </w:r>
       <w:r>
         <w:fldChar w:fldCharType="separate"/>
@@ -362,7 +362,7 @@
       </w:r>
       <w:r>
         <w:rPr/>
-        <w:t>Planification initiale</w:t>
+        <w:t>EXPLICAITON DES METHODES</w:t>
       </w:r>
       <w:r>
         <w:tab/>
@@ -371,14 +371,14 @@
         <w:fldChar w:fldCharType="begin"/>
       </w:r>
       <w:r>
-        <w:instrText xml:space="preserve">PAGEREF _Toc206092768 \h</w:instrText>
+        <w:instrText xml:space="preserve">PAGEREF _Toc1275241652 \h</w:instrText>
       </w:r>
       <w:r>
         <w:fldChar w:fldCharType="separate"/>
       </w:r>
       <w:r>
         <w:rPr/>
-        <w:t>2</w:t>
+        <w:t>3</w:t>
       </w:r>
       <w:r>
         <w:fldChar w:fldCharType="end"/>
@@ -387,7 +387,7 @@
         <w:fldChar w:fldCharType="end"/>
       </w:r>
     </w:p>
-    <w:p xmlns:wp14="http://schemas.microsoft.com/office/word/2010/wordml" wp14:textId="505672A2">
+    <w:p xmlns:wp14="http://schemas.microsoft.com/office/word/2010/wordml" wp14:textId="4EB87DFB">
       <w:pPr>
         <w:pStyle w:val="TM10"/>
         <w:tabs>
@@ -399,7 +399,7 @@
         <w:fldChar w:fldCharType="begin"/>
       </w:r>
       <w:r>
-        <w:instrText xml:space="preserve">HYPERLINK  \l  "_Toc2088800736" </w:instrText>
+        <w:instrText xml:space="preserve">HYPERLINK  \l  "_Toc876017711" </w:instrText>
       </w:r>
       <w:r>
         <w:fldChar w:fldCharType="separate"/>
@@ -413,6 +413,57 @@
       </w:r>
       <w:r>
         <w:rPr/>
+        <w:t>Planification initiale</w:t>
+      </w:r>
+      <w:r>
+        <w:tab/>
+      </w:r>
+      <w:r>
+        <w:fldChar w:fldCharType="begin"/>
+      </w:r>
+      <w:r>
+        <w:instrText xml:space="preserve">PAGEREF _Toc876017711 \h</w:instrText>
+      </w:r>
+      <w:r>
+        <w:fldChar w:fldCharType="separate"/>
+      </w:r>
+      <w:r>
+        <w:rPr/>
+        <w:t>8</w:t>
+      </w:r>
+      <w:r>
+        <w:fldChar w:fldCharType="end"/>
+      </w:r>
+      <w:r>
+        <w:fldChar w:fldCharType="end"/>
+      </w:r>
+    </w:p>
+    <w:p xmlns:wp14="http://schemas.microsoft.com/office/word/2010/wordml" wp14:textId="55DFC0D9">
+      <w:pPr>
+        <w:pStyle w:val="TM10"/>
+        <w:tabs>
+          <w:tab w:val="left" w:leader="none" w:pos="390"/>
+          <w:tab w:val="right" w:leader="dot" w:pos="9060"/>
+        </w:tabs>
+      </w:pPr>
+      <w:r>
+        <w:fldChar w:fldCharType="begin"/>
+      </w:r>
+      <w:r>
+        <w:instrText xml:space="preserve">HYPERLINK  \l  "_Toc427497782" </w:instrText>
+      </w:r>
+      <w:r>
+        <w:fldChar w:fldCharType="separate"/>
+      </w:r>
+      <w:r>
+        <w:rPr/>
+        <w:t>5</w:t>
+      </w:r>
+      <w:r>
+        <w:tab/>
+      </w:r>
+      <w:r>
+        <w:rPr/>
         <w:t>Tests</w:t>
       </w:r>
       <w:r>
@@ -422,14 +473,14 @@
         <w:fldChar w:fldCharType="begin"/>
       </w:r>
       <w:r>
-        <w:instrText xml:space="preserve">PAGEREF _Toc2088800736 \h</w:instrText>
+        <w:instrText xml:space="preserve">PAGEREF _Toc427497782 \h</w:instrText>
       </w:r>
       <w:r>
         <w:fldChar w:fldCharType="separate"/>
       </w:r>
       <w:r>
         <w:rPr/>
-        <w:t>2</w:t>
+        <w:t>8</w:t>
       </w:r>
       <w:r>
         <w:fldChar w:fldCharType="end"/>
@@ -438,7 +489,7 @@
         <w:fldChar w:fldCharType="end"/>
       </w:r>
     </w:p>
-    <w:p xmlns:wp14="http://schemas.microsoft.com/office/word/2010/wordml" wp14:textId="26436B56">
+    <w:p xmlns:wp14="http://schemas.microsoft.com/office/word/2010/wordml" wp14:textId="188956AC">
       <w:pPr>
         <w:pStyle w:val="TM2"/>
         <w:tabs>
@@ -450,14 +501,14 @@
         <w:fldChar w:fldCharType="begin"/>
       </w:r>
       <w:r>
-        <w:instrText xml:space="preserve">HYPERLINK  \l  "_Toc1645707728" </w:instrText>
+        <w:instrText xml:space="preserve">HYPERLINK  \l  "_Toc950684059" </w:instrText>
       </w:r>
       <w:r>
         <w:fldChar w:fldCharType="separate"/>
       </w:r>
       <w:r>
         <w:rPr/>
-        <w:t>4.1</w:t>
+        <w:t>5.1</w:t>
       </w:r>
       <w:r>
         <w:tab/>
@@ -473,14 +524,14 @@
         <w:fldChar w:fldCharType="begin"/>
       </w:r>
       <w:r>
-        <w:instrText xml:space="preserve">PAGEREF _Toc1645707728 \h</w:instrText>
+        <w:instrText xml:space="preserve">PAGEREF _Toc950684059 \h</w:instrText>
       </w:r>
       <w:r>
         <w:fldChar w:fldCharType="separate"/>
       </w:r>
       <w:r>
         <w:rPr/>
-        <w:t>2</w:t>
+        <w:t>8</w:t>
       </w:r>
       <w:r>
         <w:fldChar w:fldCharType="end"/>
@@ -489,7 +540,7 @@
         <w:fldChar w:fldCharType="end"/>
       </w:r>
     </w:p>
-    <w:p xmlns:wp14="http://schemas.microsoft.com/office/word/2010/wordml" wp14:textId="234EDC36">
+    <w:p>
       <w:pPr>
         <w:pStyle w:val="TM10"/>
         <w:tabs>
@@ -501,14 +552,14 @@
         <w:fldChar w:fldCharType="begin"/>
       </w:r>
       <w:r>
-        <w:instrText xml:space="preserve">HYPERLINK  \l  "_Toc1666392082" </w:instrText>
+        <w:instrText xml:space="preserve">HYPERLINK  \l  "_Toc966739610" </w:instrText>
       </w:r>
       <w:r>
         <w:fldChar w:fldCharType="separate"/>
       </w:r>
       <w:r>
         <w:rPr/>
-        <w:t>5</w:t>
+        <w:t>6</w:t>
       </w:r>
       <w:r>
         <w:tab/>
@@ -524,14 +575,14 @@
         <w:fldChar w:fldCharType="begin"/>
       </w:r>
       <w:r>
-        <w:instrText xml:space="preserve">PAGEREF _Toc1666392082 \h</w:instrText>
+        <w:instrText xml:space="preserve">PAGEREF _Toc966739610 \h</w:instrText>
       </w:r>
       <w:r>
         <w:fldChar w:fldCharType="separate"/>
       </w:r>
       <w:r>
         <w:rPr/>
-        <w:t>3</w:t>
+        <w:t>8</w:t>
       </w:r>
       <w:r>
         <w:fldChar w:fldCharType="end"/>
@@ -564,12 +615,12 @@
           <w:szCs w:val="36"/>
         </w:rPr>
       </w:pPr>
-      <w:bookmarkStart w:name="_Toc1233774730" w:id="323044487"/>
+      <w:bookmarkStart w:name="_Toc1543168939" w:id="205886266"/>
       <w:r>
         <w:rPr/>
         <w:t>Introduction</w:t>
       </w:r>
-      <w:bookmarkEnd w:id="323044487"/>
+      <w:bookmarkEnd w:id="205886266"/>
     </w:p>
     <w:p>
       <w:pPr>
@@ -581,12 +632,12 @@
         <w:jc w:val="left"/>
         <w:rPr/>
       </w:pPr>
-      <w:bookmarkStart w:name="_Toc208587097" w:id="1270840134"/>
+      <w:bookmarkStart w:name="_Toc1658641749" w:id="37050072"/>
       <w:r>
         <w:rPr/>
         <w:t>Objectifs produit et pédagogique</w:t>
       </w:r>
-      <w:bookmarkEnd w:id="1270840134"/>
+      <w:bookmarkEnd w:id="37050072"/>
     </w:p>
     <w:p>
       <w:pPr>
@@ -711,12 +762,12 @@
         <w:pStyle w:val="Titre2"/>
         <w:rPr/>
       </w:pPr>
-      <w:bookmarkStart w:name="_Toc1799430099" w:id="1927968844"/>
+      <w:bookmarkStart w:name="_Toc2109183303" w:id="1675177533"/>
       <w:r>
         <w:rPr/>
         <w:t>Description du domaine</w:t>
       </w:r>
-      <w:bookmarkEnd w:id="1927968844"/>
+      <w:bookmarkEnd w:id="1675177533"/>
     </w:p>
     <w:p>
       <w:pPr>
@@ -732,7 +783,7 @@
         <w:pStyle w:val="Titre1"/>
         <w:rPr/>
       </w:pPr>
-      <w:bookmarkStart w:name="_Toc358953706" w:id="681802279"/>
+      <w:bookmarkStart w:name="_Toc179857693" w:id="1232094026"/>
       <w:r>
         <w:rPr/>
         <w:t xml:space="preserve">Analyse </w:t>
@@ -741,7 +792,7 @@
         <w:rPr/>
         <w:t>fonctionnelle</w:t>
       </w:r>
-      <w:bookmarkEnd w:id="681802279"/>
+      <w:bookmarkEnd w:id="1232094026"/>
     </w:p>
     <w:p>
       <w:pPr>
@@ -2636,29 +2687,940 @@
     <w:p>
       <w:pPr>
         <w:pStyle w:val="Corpsdetexte"/>
+      </w:pPr>
+      <w:r>
         <w:rPr>
           <w:b w:val="0"/>
           <w:bCs w:val="0"/>
           <w:sz w:val="20"/>
           <w:szCs w:val="20"/>
         </w:rPr>
-      </w:pPr>
-      <w:r>
+        <w:t>Historique des transactions</w:t>
+      </w:r>
+    </w:p>
+    <w:p>
+      <w:pPr>
+        <w:pStyle w:val="Corpsdetexte"/>
         <w:rPr>
           <w:b w:val="0"/>
           <w:bCs w:val="0"/>
           <w:sz w:val="20"/>
           <w:szCs w:val="20"/>
         </w:rPr>
-        <w:t>Historique des transactions</w:t>
-      </w:r>
+      </w:pPr>
     </w:p>
     <w:p>
       <w:pPr>
+        <w:pStyle w:val="Corpsdetexte"/>
+        <w:rPr>
+          <w:b w:val="0"/>
+          <w:bCs w:val="0"/>
+          <w:sz w:val="20"/>
+          <w:szCs w:val="20"/>
+        </w:rPr>
+      </w:pPr>
+    </w:p>
+    <w:p>
+      <w:pPr>
+        <w:pStyle w:val="Corpsdetexte"/>
+        <w:rPr>
+          <w:b w:val="0"/>
+          <w:bCs w:val="0"/>
+          <w:sz w:val="20"/>
+          <w:szCs w:val="20"/>
+        </w:rPr>
+      </w:pPr>
+    </w:p>
+    <w:p>
+      <w:pPr>
         <w:pStyle w:val="Titre1"/>
         <w:rPr/>
       </w:pPr>
-      <w:bookmarkStart w:name="_Toc206092768" w:id="2014522540"/>
+      <w:bookmarkStart w:name="_Toc1275241652" w:id="626875407"/>
+      <w:r>
+        <w:rPr/>
+        <w:t>EXPLICAITON DES METHODES</w:t>
+      </w:r>
+      <w:bookmarkEnd w:id="626875407"/>
+    </w:p>
+    <w:p>
+      <w:pPr>
+        <w:pStyle w:val="Corpsdetexte"/>
+      </w:pPr>
+    </w:p>
+    <w:p>
+      <w:pPr>
+        <w:pStyle w:val="Corpsdetexte"/>
+        <w:numPr>
+          <w:ilvl w:val="0"/>
+          <w:numId w:val="49"/>
+        </w:numPr>
+        <w:rPr/>
+      </w:pPr>
+      <w:r>
+        <w:rPr/>
+        <w:t xml:space="preserve">Public void </w:t>
+      </w:r>
+      <w:r>
+        <w:rPr/>
+        <w:t>Menu</w:t>
+      </w:r>
+      <w:r>
+        <w:rPr/>
+        <w:t>(</w:t>
+      </w:r>
+      <w:r>
+        <w:rPr/>
+        <w:t>);</w:t>
+      </w:r>
+    </w:p>
+    <w:p>
+      <w:pPr>
+        <w:pStyle w:val="Corpsdetexte"/>
+        <w:ind w:left="567"/>
+      </w:pPr>
+      <w:r>
+        <w:drawing>
+          <wp:inline wp14:editId="23014B31" wp14:anchorId="398C45B8">
+            <wp:extent cx="5695950" cy="5762625"/>
+            <wp:effectExtent l="0" t="0" r="0" b="0"/>
+            <wp:docPr id="530176098" name="drawing"/>
+            <wp:cNvGraphicFramePr>
+              <a:graphicFrameLocks noChangeAspect="1"/>
+            </wp:cNvGraphicFramePr>
+            <a:graphic>
+              <a:graphicData xmlns:a="http://schemas.openxmlformats.org/drawingml/2006/main" uri="http://schemas.openxmlformats.org/drawingml/2006/picture">
+                <pic:pic xmlns:pic="http://schemas.openxmlformats.org/drawingml/2006/picture">
+                  <pic:nvPicPr>
+                    <pic:cNvPr id="530176098" name="Picture 530176098"/>
+                    <pic:cNvPicPr/>
+                  </pic:nvPicPr>
+                  <pic:blipFill>
+                    <a:blip xmlns:r="http://schemas.openxmlformats.org/officeDocument/2006/relationships" r:embed="rId1409670008">
+                      <a:extLst>
+                        <a:ext uri="{28A0092B-C50C-407E-A947-70E740481C1C}">
+                          <a14:useLocalDpi xmlns:a14="http://schemas.microsoft.com/office/drawing/2010/main"/>
+                        </a:ext>
+                      </a:extLst>
+                    </a:blip>
+                    <a:stretch>
+                      <a:fillRect/>
+                    </a:stretch>
+                  </pic:blipFill>
+                  <pic:spPr>
+                    <a:xfrm>
+                      <a:off x="0" y="0"/>
+                      <a:ext cx="5695950" cy="5762625"/>
+                    </a:xfrm>
+                    <a:prstGeom prst="rect">
+                      <a:avLst/>
+                    </a:prstGeom>
+                  </pic:spPr>
+                </pic:pic>
+              </a:graphicData>
+            </a:graphic>
+          </wp:inline>
+        </w:drawing>
+      </w:r>
+      <w:r>
+        <w:rPr/>
+        <w:t xml:space="preserve">Ici le menu (donc string MENU_TEXT) affiche les options possibles, </w:t>
+      </w:r>
+      <w:r>
+        <w:rPr/>
+        <w:t>apres</w:t>
+      </w:r>
+      <w:r>
+        <w:rPr/>
+        <w:t xml:space="preserve"> quoi le </w:t>
+      </w:r>
+      <w:r>
+        <w:rPr/>
+        <w:t>void</w:t>
+      </w:r>
+      <w:r>
+        <w:rPr/>
+        <w:t xml:space="preserve"> menu lui </w:t>
+      </w:r>
+      <w:r>
+        <w:rPr/>
+        <w:t>meme</w:t>
+      </w:r>
+      <w:r>
+        <w:rPr/>
+        <w:t xml:space="preserve"> a un switch qui indique que si choix est </w:t>
+      </w:r>
+      <w:r>
+        <w:rPr/>
+        <w:t>egal</w:t>
+      </w:r>
+      <w:r>
+        <w:rPr/>
+        <w:t xml:space="preserve"> a 1 par exemple, il appelle la methode VehicleEntry();</w:t>
+      </w:r>
+    </w:p>
+    <w:p>
+      <w:pPr>
+        <w:pStyle w:val="Corpsdetexte"/>
+        <w:ind w:left="567"/>
+      </w:pPr>
+    </w:p>
+    <w:p>
+      <w:pPr>
+        <w:pStyle w:val="Corpsdetexte"/>
+        <w:ind w:left="567"/>
+      </w:pPr>
+      <w:r>
+        <w:rPr/>
+        <w:t>VehicleEntry</w:t>
+      </w:r>
+      <w:r>
+        <w:rPr/>
+        <w:t>();</w:t>
+      </w:r>
+    </w:p>
+    <w:p>
+      <w:pPr>
+        <w:pStyle w:val="Corpsdetexte"/>
+        <w:ind w:left="567"/>
+      </w:pPr>
+      <w:r>
+        <w:drawing>
+          <wp:inline wp14:editId="626AE50B" wp14:anchorId="71CF07D6">
+            <wp:extent cx="5762625" cy="4791075"/>
+            <wp:effectExtent l="0" t="0" r="0" b="0"/>
+            <wp:docPr id="1634229026" name="drawing"/>
+            <wp:cNvGraphicFramePr>
+              <a:graphicFrameLocks noChangeAspect="1"/>
+            </wp:cNvGraphicFramePr>
+            <a:graphic>
+              <a:graphicData xmlns:a="http://schemas.openxmlformats.org/drawingml/2006/main" uri="http://schemas.openxmlformats.org/drawingml/2006/picture">
+                <pic:pic xmlns:pic="http://schemas.openxmlformats.org/drawingml/2006/picture">
+                  <pic:nvPicPr>
+                    <pic:cNvPr id="1634229026" name="Picture 1634229026"/>
+                    <pic:cNvPicPr/>
+                  </pic:nvPicPr>
+                  <pic:blipFill>
+                    <a:blip xmlns:r="http://schemas.openxmlformats.org/officeDocument/2006/relationships" r:embed="rId383705810">
+                      <a:extLst>
+                        <a:ext uri="{28A0092B-C50C-407E-A947-70E740481C1C}">
+                          <a14:useLocalDpi xmlns:a14="http://schemas.microsoft.com/office/drawing/2010/main"/>
+                        </a:ext>
+                      </a:extLst>
+                    </a:blip>
+                    <a:stretch>
+                      <a:fillRect/>
+                    </a:stretch>
+                  </pic:blipFill>
+                  <pic:spPr>
+                    <a:xfrm>
+                      <a:off x="0" y="0"/>
+                      <a:ext cx="5762625" cy="4791075"/>
+                    </a:xfrm>
+                    <a:prstGeom prst="rect">
+                      <a:avLst/>
+                    </a:prstGeom>
+                  </pic:spPr>
+                </pic:pic>
+              </a:graphicData>
+            </a:graphic>
+          </wp:inline>
+        </w:drawing>
+      </w:r>
+    </w:p>
+    <w:p>
+      <w:pPr>
+        <w:pStyle w:val="Corpsdetexte"/>
+        <w:ind w:left="567"/>
+      </w:pPr>
+      <w:r>
+        <w:rPr/>
+        <w:t xml:space="preserve">Ici tout d’abord on affiche le texte pour demander </w:t>
+      </w:r>
+      <w:r>
+        <w:rPr/>
+        <w:t>a</w:t>
+      </w:r>
+      <w:r>
+        <w:rPr/>
+        <w:t xml:space="preserve"> la personne en question d’entrer la plaque d’immatriculation. Ensuite on </w:t>
+      </w:r>
+      <w:r>
+        <w:rPr/>
+        <w:t>vérifie</w:t>
+      </w:r>
+      <w:r>
+        <w:rPr/>
+        <w:t xml:space="preserve"> que le parking n’est pas rempli, sinon on dit de sortir un </w:t>
+      </w:r>
+      <w:r>
+        <w:rPr/>
+        <w:t>véhicule</w:t>
+      </w:r>
+      <w:r>
+        <w:rPr/>
+        <w:t xml:space="preserve">. Ensuite le </w:t>
+      </w:r>
+      <w:r>
+        <w:rPr/>
+        <w:t>entryHou</w:t>
+      </w:r>
+      <w:r>
+        <w:rPr/>
+        <w:t>r</w:t>
+      </w:r>
+      <w:r>
+        <w:rPr/>
+        <w:t xml:space="preserve"> et </w:t>
+      </w:r>
+      <w:r>
+        <w:rPr/>
+        <w:t>entryMinute</w:t>
+      </w:r>
+      <w:r>
+        <w:rPr/>
+        <w:t xml:space="preserve"> </w:t>
+      </w:r>
+      <w:r>
+        <w:rPr/>
+        <w:t>génère</w:t>
+      </w:r>
+      <w:r>
+        <w:rPr/>
+        <w:t xml:space="preserve"> une heure et minute </w:t>
+      </w:r>
+      <w:r>
+        <w:rPr/>
+        <w:t>aléatoire</w:t>
+      </w:r>
+      <w:r>
+        <w:rPr/>
+        <w:t xml:space="preserve"> d’</w:t>
+      </w:r>
+      <w:r>
+        <w:rPr/>
+        <w:t>entrée</w:t>
+      </w:r>
+      <w:r>
+        <w:rPr/>
+        <w:t xml:space="preserve">. </w:t>
+      </w:r>
+      <w:r>
+        <w:rPr/>
+        <w:t>Après</w:t>
+      </w:r>
+      <w:r>
+        <w:rPr/>
+        <w:t xml:space="preserve"> </w:t>
+      </w:r>
+      <w:r>
+        <w:rPr/>
+        <w:t>ça</w:t>
+      </w:r>
+      <w:r>
+        <w:rPr/>
+        <w:t xml:space="preserve"> un nouveau </w:t>
+      </w:r>
+      <w:r>
+        <w:rPr/>
+        <w:t>véhicule</w:t>
+      </w:r>
+      <w:r>
+        <w:rPr/>
+        <w:t xml:space="preserve"> est </w:t>
+      </w:r>
+      <w:r>
+        <w:rPr/>
+        <w:t>créé</w:t>
+      </w:r>
+      <w:r>
+        <w:rPr/>
+        <w:t xml:space="preserve"> avec ticket qui est lié </w:t>
+      </w:r>
+      <w:r>
+        <w:rPr/>
+        <w:t>a</w:t>
+      </w:r>
+      <w:r>
+        <w:rPr/>
+        <w:t xml:space="preserve"> la voiture en question, et le ticket s’affiche dans la console avec l’heure d’</w:t>
+      </w:r>
+      <w:r>
+        <w:rPr/>
+        <w:t>entrée</w:t>
+      </w:r>
+      <w:r>
+        <w:rPr/>
+        <w:t>, la place et le tarif horaire.</w:t>
+      </w:r>
+      <w:r>
+        <w:rPr/>
+        <w:t xml:space="preserve"> La </w:t>
+      </w:r>
+      <w:r>
+        <w:rPr/>
+        <w:t>première</w:t>
+      </w:r>
+      <w:r>
+        <w:rPr/>
+        <w:t xml:space="preserve"> place alors est occupé et</w:t>
+      </w:r>
+    </w:p>
+    <w:p>
+      <w:pPr>
+        <w:pStyle w:val="Corpsdetexte"/>
+        <w:ind w:left="567"/>
+      </w:pPr>
+    </w:p>
+    <w:p>
+      <w:pPr>
+        <w:pStyle w:val="Corpsdetexte"/>
+        <w:ind w:left="567"/>
+      </w:pPr>
+    </w:p>
+    <w:p>
+      <w:pPr>
+        <w:pStyle w:val="Corpsdetexte"/>
+        <w:ind w:left="567"/>
+      </w:pPr>
+    </w:p>
+    <w:p>
+      <w:pPr>
+        <w:pStyle w:val="Corpsdetexte"/>
+        <w:ind w:left="567"/>
+      </w:pPr>
+    </w:p>
+    <w:p>
+      <w:pPr>
+        <w:pStyle w:val="Corpsdetexte"/>
+        <w:ind w:left="567"/>
+      </w:pPr>
+    </w:p>
+    <w:p>
+      <w:pPr>
+        <w:pStyle w:val="Corpsdetexte"/>
+        <w:ind w:left="567"/>
+      </w:pPr>
+    </w:p>
+    <w:p>
+      <w:pPr>
+        <w:pStyle w:val="Corpsdetexte"/>
+        <w:ind w:left="567"/>
+      </w:pPr>
+    </w:p>
+    <w:p>
+      <w:pPr>
+        <w:pStyle w:val="Corpsdetexte"/>
+        <w:ind w:left="567"/>
+      </w:pPr>
+    </w:p>
+    <w:p>
+      <w:pPr>
+        <w:pStyle w:val="Corpsdetexte"/>
+        <w:ind w:left="567"/>
+      </w:pPr>
+    </w:p>
+    <w:p>
+      <w:pPr>
+        <w:pStyle w:val="Corpsdetexte"/>
+        <w:ind w:left="567"/>
+      </w:pPr>
+    </w:p>
+    <w:p>
+      <w:pPr>
+        <w:pStyle w:val="Corpsdetexte"/>
+        <w:ind w:left="567"/>
+      </w:pPr>
+      <w:r>
+        <w:rPr/>
+        <w:t xml:space="preserve">        public void VehicleExit()</w:t>
+      </w:r>
+    </w:p>
+    <w:p>
+      <w:pPr>
+        <w:pStyle w:val="Corpsdetexte"/>
+        <w:ind w:left="567"/>
+      </w:pPr>
+      <w:r>
+        <w:drawing>
+          <wp:inline wp14:editId="79C9CCE6" wp14:anchorId="778DA042">
+            <wp:extent cx="5762625" cy="3105150"/>
+            <wp:effectExtent l="0" t="0" r="0" b="0"/>
+            <wp:docPr id="888820127" name="drawing"/>
+            <wp:cNvGraphicFramePr>
+              <a:graphicFrameLocks noChangeAspect="1"/>
+            </wp:cNvGraphicFramePr>
+            <a:graphic>
+              <a:graphicData xmlns:a="http://schemas.openxmlformats.org/drawingml/2006/main" uri="http://schemas.openxmlformats.org/drawingml/2006/picture">
+                <pic:pic xmlns:pic="http://schemas.openxmlformats.org/drawingml/2006/picture">
+                  <pic:nvPicPr>
+                    <pic:cNvPr id="888820127" name="Picture 888820127"/>
+                    <pic:cNvPicPr/>
+                  </pic:nvPicPr>
+                  <pic:blipFill>
+                    <a:blip xmlns:r="http://schemas.openxmlformats.org/officeDocument/2006/relationships" r:embed="rId748893861">
+                      <a:extLst>
+                        <a:ext uri="{28A0092B-C50C-407E-A947-70E740481C1C}">
+                          <a14:useLocalDpi xmlns:a14="http://schemas.microsoft.com/office/drawing/2010/main"/>
+                        </a:ext>
+                      </a:extLst>
+                    </a:blip>
+                    <a:stretch>
+                      <a:fillRect/>
+                    </a:stretch>
+                  </pic:blipFill>
+                  <pic:spPr>
+                    <a:xfrm>
+                      <a:off x="0" y="0"/>
+                      <a:ext cx="5762625" cy="3105150"/>
+                    </a:xfrm>
+                    <a:prstGeom prst="rect">
+                      <a:avLst/>
+                    </a:prstGeom>
+                  </pic:spPr>
+                </pic:pic>
+              </a:graphicData>
+            </a:graphic>
+          </wp:inline>
+        </w:drawing>
+      </w:r>
+    </w:p>
+    <w:p>
+      <w:pPr>
+        <w:pStyle w:val="Corpsdetexte"/>
+        <w:ind w:left="567"/>
+      </w:pPr>
+      <w:r>
+        <w:rPr/>
+        <w:t xml:space="preserve">Le </w:t>
+      </w:r>
+      <w:r>
+        <w:rPr/>
+        <w:t>VehicleExit</w:t>
+      </w:r>
+      <w:r>
+        <w:rPr/>
+        <w:t xml:space="preserve"> (sortie) demande </w:t>
+      </w:r>
+      <w:r>
+        <w:rPr/>
+        <w:t>d'abord</w:t>
+      </w:r>
+      <w:r>
+        <w:rPr/>
+        <w:t xml:space="preserve"> quel </w:t>
+      </w:r>
+      <w:r>
+        <w:rPr/>
+        <w:t>véhicule</w:t>
+      </w:r>
+      <w:r>
+        <w:rPr/>
+        <w:t xml:space="preserve"> l’utilisateur veux sortir. Il </w:t>
+      </w:r>
+      <w:r>
+        <w:rPr/>
+        <w:t>parcoure</w:t>
+      </w:r>
+      <w:r>
+        <w:rPr/>
+        <w:t xml:space="preserve"> ensuite tout le tabl</w:t>
+      </w:r>
+      <w:r>
+        <w:rPr/>
+        <w:t>eau</w:t>
+      </w:r>
+      <w:r>
+        <w:rPr/>
+        <w:t xml:space="preserve"> de </w:t>
+      </w:r>
+      <w:r>
+        <w:rPr/>
+        <w:t>véhicule</w:t>
+      </w:r>
+      <w:r>
+        <w:rPr/>
+        <w:t xml:space="preserve"> dans _</w:t>
+      </w:r>
+      <w:r>
+        <w:rPr/>
+        <w:t>vehicles</w:t>
+      </w:r>
+      <w:r>
+        <w:rPr/>
+        <w:t xml:space="preserve"> et </w:t>
+      </w:r>
+      <w:r>
+        <w:rPr/>
+        <w:t>s'il</w:t>
+      </w:r>
+      <w:r>
+        <w:rPr/>
+        <w:t xml:space="preserve"> n’est pas nul, il affiche les </w:t>
+      </w:r>
+      <w:r>
+        <w:rPr/>
+        <w:t>paramètres</w:t>
+      </w:r>
+      <w:r>
+        <w:rPr/>
+        <w:t xml:space="preserve"> du </w:t>
+      </w:r>
+      <w:r>
+        <w:rPr/>
+        <w:t>véhicule</w:t>
+      </w:r>
+      <w:r>
+        <w:rPr/>
+        <w:t xml:space="preserve"> en question et demande </w:t>
+      </w:r>
+      <w:r>
+        <w:rPr/>
+        <w:t>s'il</w:t>
+      </w:r>
+      <w:r>
+        <w:rPr/>
+        <w:t xml:space="preserve"> veut le sortir </w:t>
+      </w:r>
+      <w:r>
+        <w:rPr/>
+        <w:t>réellement</w:t>
+      </w:r>
+      <w:r>
+        <w:rPr/>
+        <w:t xml:space="preserve">, et si oui il le supprime </w:t>
+      </w:r>
+      <w:r>
+        <w:rPr/>
+        <w:t>du tableau</w:t>
+      </w:r>
+      <w:r>
+        <w:rPr/>
+        <w:t xml:space="preserve"> des </w:t>
+      </w:r>
+      <w:r>
+        <w:rPr/>
+        <w:t xml:space="preserve">véhicules et du parking </w:t>
+      </w:r>
+      <w:r>
+        <w:rPr/>
+        <w:t>lui-même</w:t>
+      </w:r>
+      <w:r>
+        <w:rPr/>
+        <w:t>.</w:t>
+      </w:r>
+    </w:p>
+    <w:p>
+      <w:pPr>
+        <w:pStyle w:val="Corpsdetexte"/>
+        <w:ind w:left="567"/>
+      </w:pPr>
+    </w:p>
+    <w:p>
+      <w:pPr>
+        <w:pStyle w:val="Corpsdetexte"/>
+        <w:ind w:left="567"/>
+      </w:pPr>
+    </w:p>
+    <w:p>
+      <w:pPr>
+        <w:pStyle w:val="Corpsdetexte"/>
+        <w:ind w:left="567"/>
+      </w:pPr>
+    </w:p>
+    <w:p>
+      <w:pPr>
+        <w:pStyle w:val="Corpsdetexte"/>
+        <w:ind w:left="567"/>
+      </w:pPr>
+    </w:p>
+    <w:p>
+      <w:pPr>
+        <w:pStyle w:val="Corpsdetexte"/>
+        <w:ind w:left="567"/>
+      </w:pPr>
+    </w:p>
+    <w:p>
+      <w:pPr>
+        <w:pStyle w:val="Corpsdetexte"/>
+        <w:ind w:left="567"/>
+      </w:pPr>
+    </w:p>
+    <w:p>
+      <w:pPr>
+        <w:pStyle w:val="Corpsdetexte"/>
+        <w:ind w:left="567"/>
+      </w:pPr>
+    </w:p>
+    <w:p>
+      <w:pPr>
+        <w:pStyle w:val="Corpsdetexte"/>
+        <w:ind w:left="567"/>
+      </w:pPr>
+    </w:p>
+    <w:p>
+      <w:pPr>
+        <w:pStyle w:val="Corpsdetexte"/>
+        <w:ind w:left="567"/>
+      </w:pPr>
+    </w:p>
+    <w:p>
+      <w:pPr>
+        <w:pStyle w:val="Corpsdetexte"/>
+        <w:ind w:left="567"/>
+      </w:pPr>
+    </w:p>
+    <w:p>
+      <w:pPr>
+        <w:pStyle w:val="Corpsdetexte"/>
+        <w:ind w:left="567"/>
+      </w:pPr>
+    </w:p>
+    <w:p>
+      <w:pPr>
+        <w:pStyle w:val="Corpsdetexte"/>
+        <w:ind w:left="567"/>
+      </w:pPr>
+    </w:p>
+    <w:p>
+      <w:pPr>
+        <w:pStyle w:val="Corpsdetexte"/>
+        <w:ind w:left="567"/>
+      </w:pPr>
+    </w:p>
+    <w:p>
+      <w:pPr>
+        <w:pStyle w:val="Corpsdetexte"/>
+        <w:ind w:left="567"/>
+      </w:pPr>
+    </w:p>
+    <w:p>
+      <w:pPr>
+        <w:pStyle w:val="Corpsdetexte"/>
+        <w:ind w:left="567"/>
+      </w:pPr>
+    </w:p>
+    <w:p>
+      <w:pPr>
+        <w:pStyle w:val="Corpsdetexte"/>
+        <w:ind w:left="567"/>
+      </w:pPr>
+    </w:p>
+    <w:p>
+      <w:pPr>
+        <w:pStyle w:val="Corpsdetexte"/>
+        <w:ind w:left="567"/>
+      </w:pPr>
+    </w:p>
+    <w:p>
+      <w:pPr>
+        <w:pStyle w:val="Corpsdetexte"/>
+        <w:ind w:left="567"/>
+      </w:pPr>
+      <w:r>
+        <w:rPr/>
+        <w:t xml:space="preserve">        public void ShowParkingState()</w:t>
+      </w:r>
+    </w:p>
+    <w:p>
+      <w:pPr>
+        <w:pStyle w:val="Corpsdetexte"/>
+        <w:ind w:left="567"/>
+      </w:pPr>
+    </w:p>
+    <w:p>
+      <w:pPr>
+        <w:pStyle w:val="Corpsdetexte"/>
+        <w:ind w:left="567"/>
+      </w:pPr>
+      <w:r>
+        <w:drawing>
+          <wp:inline wp14:editId="411CEF44" wp14:anchorId="7D3499A7">
+            <wp:extent cx="5762625" cy="5229225"/>
+            <wp:effectExtent l="0" t="0" r="0" b="0"/>
+            <wp:docPr id="689266932" name="drawing"/>
+            <wp:cNvGraphicFramePr>
+              <a:graphicFrameLocks noChangeAspect="1"/>
+            </wp:cNvGraphicFramePr>
+            <a:graphic>
+              <a:graphicData xmlns:a="http://schemas.openxmlformats.org/drawingml/2006/main" uri="http://schemas.openxmlformats.org/drawingml/2006/picture">
+                <pic:pic xmlns:pic="http://schemas.openxmlformats.org/drawingml/2006/picture">
+                  <pic:nvPicPr>
+                    <pic:cNvPr id="689266932" name="Picture 689266932"/>
+                    <pic:cNvPicPr/>
+                  </pic:nvPicPr>
+                  <pic:blipFill>
+                    <a:blip xmlns:r="http://schemas.openxmlformats.org/officeDocument/2006/relationships" r:embed="rId1225695833">
+                      <a:extLst>
+                        <a:ext uri="{28A0092B-C50C-407E-A947-70E740481C1C}">
+                          <a14:useLocalDpi xmlns:a14="http://schemas.microsoft.com/office/drawing/2010/main"/>
+                        </a:ext>
+                      </a:extLst>
+                    </a:blip>
+                    <a:stretch>
+                      <a:fillRect/>
+                    </a:stretch>
+                  </pic:blipFill>
+                  <pic:spPr>
+                    <a:xfrm>
+                      <a:off x="0" y="0"/>
+                      <a:ext cx="5762625" cy="5229225"/>
+                    </a:xfrm>
+                    <a:prstGeom prst="rect">
+                      <a:avLst/>
+                    </a:prstGeom>
+                  </pic:spPr>
+                </pic:pic>
+              </a:graphicData>
+            </a:graphic>
+          </wp:inline>
+        </w:drawing>
+      </w:r>
+    </w:p>
+    <w:p>
+      <w:pPr>
+        <w:pStyle w:val="Corpsdetexte"/>
+        <w:ind w:left="567"/>
+      </w:pPr>
+      <w:r>
+        <w:rPr/>
+        <w:t xml:space="preserve">La </w:t>
+      </w:r>
+      <w:r>
+        <w:rPr/>
+        <w:t>méthode</w:t>
+      </w:r>
+      <w:r>
+        <w:rPr/>
+        <w:t xml:space="preserve"> </w:t>
+      </w:r>
+      <w:r>
+        <w:rPr/>
+        <w:t>ShowParkingState</w:t>
+      </w:r>
+      <w:r>
+        <w:rPr/>
+        <w:t xml:space="preserve"> compte d'abord les places occupées et libres, et calcule le pourcentage d'occupation. Ensuite elle dessine le plan : pour chaque place, elle écrit son numéro et un X rouge si elle est prise ou un L vert si elle est libre, avec un retour à la ligne toutes les 5 places. Pour finir, elle liste les véhicules présents avec leur place, leur plaque et le temps passé.</w:t>
+      </w:r>
+    </w:p>
+    <w:p>
+      <w:pPr>
+        <w:pStyle w:val="Corpsdetexte"/>
+        <w:ind w:left="567"/>
+      </w:pPr>
+      <w:r>
+        <w:rPr/>
+        <w:t>SearchVehicle()</w:t>
+      </w:r>
+    </w:p>
+    <w:p>
+      <w:pPr>
+        <w:pStyle w:val="Corpsdetexte"/>
+        <w:ind w:left="567"/>
+      </w:pPr>
+    </w:p>
+    <w:p>
+      <w:pPr>
+        <w:pStyle w:val="Corpsdetexte"/>
+        <w:ind w:left="567"/>
+      </w:pPr>
+    </w:p>
+    <w:p>
+      <w:pPr>
+        <w:pStyle w:val="Corpsdetexte"/>
+        <w:ind w:left="567"/>
+      </w:pPr>
+    </w:p>
+    <w:p>
+      <w:pPr>
+        <w:pStyle w:val="Corpsdetexte"/>
+        <w:ind w:left="567"/>
+      </w:pPr>
+    </w:p>
+    <w:p>
+      <w:pPr>
+        <w:pStyle w:val="Corpsdetexte"/>
+        <w:ind w:left="567"/>
+      </w:pPr>
+    </w:p>
+    <w:p>
+      <w:pPr>
+        <w:pStyle w:val="Corpsdetexte"/>
+        <w:ind w:left="567"/>
+      </w:pPr>
+    </w:p>
+    <w:p>
+      <w:pPr>
+        <w:pStyle w:val="Corpsdetexte"/>
+        <w:ind w:left="567"/>
+      </w:pPr>
+    </w:p>
+    <w:p>
+      <w:pPr>
+        <w:pStyle w:val="Corpsdetexte"/>
+        <w:ind w:left="567"/>
+      </w:pPr>
+      <w:r>
+        <w:drawing>
+          <wp:inline wp14:editId="0C228A37" wp14:anchorId="74EAB0D3">
+            <wp:extent cx="5762625" cy="1847850"/>
+            <wp:effectExtent l="0" t="0" r="0" b="0"/>
+            <wp:docPr id="1054274813" name="drawing"/>
+            <wp:cNvGraphicFramePr>
+              <a:graphicFrameLocks noChangeAspect="1"/>
+            </wp:cNvGraphicFramePr>
+            <a:graphic>
+              <a:graphicData xmlns:a="http://schemas.openxmlformats.org/drawingml/2006/main" uri="http://schemas.openxmlformats.org/drawingml/2006/picture">
+                <pic:pic xmlns:pic="http://schemas.openxmlformats.org/drawingml/2006/picture">
+                  <pic:nvPicPr>
+                    <pic:cNvPr id="728505112" name="Picture 728505112"/>
+                    <pic:cNvPicPr/>
+                  </pic:nvPicPr>
+                  <pic:blipFill>
+                    <a:blip xmlns:r="http://schemas.openxmlformats.org/officeDocument/2006/relationships" r:embed="rId1259703536">
+                      <a:extLst>
+                        <a:ext uri="{28A0092B-C50C-407E-A947-70E740481C1C}">
+                          <a14:useLocalDpi xmlns:a14="http://schemas.microsoft.com/office/drawing/2010/main"/>
+                        </a:ext>
+                      </a:extLst>
+                    </a:blip>
+                    <a:stretch>
+                      <a:fillRect/>
+                    </a:stretch>
+                  </pic:blipFill>
+                  <pic:spPr>
+                    <a:xfrm>
+                      <a:off x="0" y="0"/>
+                      <a:ext cx="5762625" cy="1847850"/>
+                    </a:xfrm>
+                    <a:prstGeom prst="rect">
+                      <a:avLst/>
+                    </a:prstGeom>
+                  </pic:spPr>
+                </pic:pic>
+              </a:graphicData>
+            </a:graphic>
+          </wp:inline>
+        </w:drawing>
+      </w:r>
+    </w:p>
+    <w:p>
+      <w:pPr>
+        <w:pStyle w:val="Corpsdetexte"/>
+        <w:ind w:left="567"/>
+      </w:pPr>
+      <w:r>
+        <w:rPr/>
+        <w:t>Cette méthode demande une plaque ou un numéro de place, puis affiche le ticket du véhicule : plaque, heure d'entrée, durée, prix actuel et place.</w:t>
+      </w:r>
+    </w:p>
+    <w:p>
+      <w:pPr>
+        <w:pStyle w:val="Titre1"/>
+        <w:rPr/>
+      </w:pPr>
+      <w:bookmarkStart w:name="_Toc876017711" w:id="659383810"/>
       <w:r>
         <w:rPr/>
         <w:t>Planification</w:t>
@@ -2667,7 +3629,7 @@
         <w:rPr/>
         <w:t xml:space="preserve"> initiale</w:t>
       </w:r>
-      <w:bookmarkEnd w:id="2014522540"/>
+      <w:bookmarkEnd w:id="659383810"/>
     </w:p>
     <w:p>
       <w:pPr>
@@ -2697,14 +3659,14 @@
       </w:pPr>
       <w:bookmarkStart w:name="_Toc532179966" w:id="42"/>
       <w:bookmarkStart w:name="_Toc165969650" w:id="43"/>
-      <w:bookmarkStart w:name="_Toc2088800736" w:id="789826355"/>
+      <w:bookmarkStart w:name="_Toc427497782" w:id="1963891203"/>
       <w:r>
         <w:rPr/>
         <w:t>Tests</w:t>
       </w:r>
       <w:bookmarkEnd w:id="42"/>
       <w:bookmarkEnd w:id="43"/>
-      <w:bookmarkEnd w:id="789826355"/>
+      <w:bookmarkEnd w:id="1963891203"/>
     </w:p>
     <w:p xmlns:wp14="http://schemas.microsoft.com/office/word/2010/wordml" wp14:textId="77777777">
       <w:pPr>
@@ -2714,7 +3676,7 @@
       <w:bookmarkStart w:name="_Toc532179968" w:id="45"/>
       <w:bookmarkStart w:name="_Toc165969652" w:id="46"/>
       <w:bookmarkStart w:name="_Ref308525868" w:id="47"/>
-      <w:bookmarkStart w:name="_Toc1645707728" w:id="1567026892"/>
+      <w:bookmarkStart w:name="_Toc950684059" w:id="1093834732"/>
       <w:r>
         <w:rPr/>
         <w:t>Dossier des tests</w:t>
@@ -2722,7 +3684,7 @@
       <w:bookmarkEnd w:id="45"/>
       <w:bookmarkEnd w:id="46"/>
       <w:bookmarkEnd w:id="47"/>
-      <w:bookmarkEnd w:id="1567026892"/>
+      <w:bookmarkEnd w:id="1093834732"/>
     </w:p>
     <w:p xmlns:wp14="http://schemas.microsoft.com/office/word/2010/wordml" wp14:textId="77777777">
       <w:pPr>
@@ -2873,12 +3835,12 @@
         <w:pStyle w:val="Titre1"/>
         <w:rPr/>
       </w:pPr>
-      <w:bookmarkStart w:name="_Toc1666392082" w:id="533286572"/>
+      <w:bookmarkStart w:name="_Toc966739610" w:id="239286490"/>
       <w:r>
         <w:rPr/>
         <w:t>Annexes</w:t>
       </w:r>
-      <w:bookmarkEnd w:id="533286572"/>
+      <w:bookmarkEnd w:id="239286490"/>
     </w:p>
     <w:p>
       <w:pPr>
@@ -3736,6 +4698,9 @@
 <file path=word/intelligence2.xml><?xml version="1.0" encoding="utf-8"?>
 <int2:intelligence xmlns:int2="http://schemas.microsoft.com/office/intelligence/2020/intelligence">
   <int2:observations>
+    <int2:textHash int2:hashCode="PtyPSVwjDTEiQm" int2:id="PZTHb8V7">
+      <int2:state int2:type="spell" int2:value="Rejected"/>
+    </int2:textHash>
     <int2:textHash int2:hashCode="2zA2/+GwTRHZ2n" int2:id="ANKoE537">
       <int2:state int2:type="spell" int2:value="Rejected"/>
     </int2:textHash>
@@ -3784,6 +4749,91 @@
       </v:shape>
     </w:pict>
   </w:numPicBullet>
+  <w:abstractNum xmlns:w="http://schemas.openxmlformats.org/wordprocessingml/2006/main" w:abstractNumId="41">
+    <w:nsid w:val="3adbc1cc"/>
+    <w:multiLevelType xmlns:w="http://schemas.openxmlformats.org/wordprocessingml/2006/main" w:val="hybridMultilevel"/>
+    <w:lvl xmlns:w="http://schemas.openxmlformats.org/wordprocessingml/2006/main" w:ilvl="0">
+      <w:start w:val="1"/>
+      <w:numFmt w:val="decimal"/>
+      <w:lvlText w:val="%1."/>
+      <w:lvlJc w:val="left"/>
+      <w:pPr>
+        <w:ind w:left="927" w:hanging="360"/>
+      </w:pPr>
+    </w:lvl>
+    <w:lvl xmlns:w="http://schemas.openxmlformats.org/wordprocessingml/2006/main" w:ilvl="1">
+      <w:start w:val="1"/>
+      <w:numFmt w:val="lowerLetter"/>
+      <w:lvlText w:val="%2."/>
+      <w:lvlJc w:val="left"/>
+      <w:pPr>
+        <w:ind w:left="1647" w:hanging="360"/>
+      </w:pPr>
+    </w:lvl>
+    <w:lvl xmlns:w="http://schemas.openxmlformats.org/wordprocessingml/2006/main" w:ilvl="2">
+      <w:start w:val="1"/>
+      <w:numFmt w:val="lowerRoman"/>
+      <w:lvlText w:val="%3."/>
+      <w:lvlJc w:val="right"/>
+      <w:pPr>
+        <w:ind w:left="2367" w:hanging="180"/>
+      </w:pPr>
+    </w:lvl>
+    <w:lvl xmlns:w="http://schemas.openxmlformats.org/wordprocessingml/2006/main" w:ilvl="3">
+      <w:start w:val="1"/>
+      <w:numFmt w:val="decimal"/>
+      <w:lvlText w:val="%4."/>
+      <w:lvlJc w:val="left"/>
+      <w:pPr>
+        <w:ind w:left="3087" w:hanging="360"/>
+      </w:pPr>
+    </w:lvl>
+    <w:lvl xmlns:w="http://schemas.openxmlformats.org/wordprocessingml/2006/main" w:ilvl="4">
+      <w:start w:val="1"/>
+      <w:numFmt w:val="lowerLetter"/>
+      <w:lvlText w:val="%5."/>
+      <w:lvlJc w:val="left"/>
+      <w:pPr>
+        <w:ind w:left="3807" w:hanging="360"/>
+      </w:pPr>
+    </w:lvl>
+    <w:lvl xmlns:w="http://schemas.openxmlformats.org/wordprocessingml/2006/main" w:ilvl="5">
+      <w:start w:val="1"/>
+      <w:numFmt w:val="lowerRoman"/>
+      <w:lvlText w:val="%6."/>
+      <w:lvlJc w:val="right"/>
+      <w:pPr>
+        <w:ind w:left="4527" w:hanging="180"/>
+      </w:pPr>
+    </w:lvl>
+    <w:lvl xmlns:w="http://schemas.openxmlformats.org/wordprocessingml/2006/main" w:ilvl="6">
+      <w:start w:val="1"/>
+      <w:numFmt w:val="decimal"/>
+      <w:lvlText w:val="%7."/>
+      <w:lvlJc w:val="left"/>
+      <w:pPr>
+        <w:ind w:left="5247" w:hanging="360"/>
+      </w:pPr>
+    </w:lvl>
+    <w:lvl xmlns:w="http://schemas.openxmlformats.org/wordprocessingml/2006/main" w:ilvl="7">
+      <w:start w:val="1"/>
+      <w:numFmt w:val="lowerLetter"/>
+      <w:lvlText w:val="%8."/>
+      <w:lvlJc w:val="left"/>
+      <w:pPr>
+        <w:ind w:left="5967" w:hanging="360"/>
+      </w:pPr>
+    </w:lvl>
+    <w:lvl xmlns:w="http://schemas.openxmlformats.org/wordprocessingml/2006/main" w:ilvl="8">
+      <w:start w:val="1"/>
+      <w:numFmt w:val="lowerRoman"/>
+      <w:lvlText w:val="%9."/>
+      <w:lvlJc w:val="right"/>
+      <w:pPr>
+        <w:ind w:left="6687" w:hanging="180"/>
+      </w:pPr>
+    </w:lvl>
+  </w:abstractNum>
   <w:abstractNum xmlns:w="http://schemas.openxmlformats.org/wordprocessingml/2006/main" w:abstractNumId="40">
     <w:nsid w:val="4053d7aa"/>
     <w:multiLevelType xmlns:w="http://schemas.openxmlformats.org/wordprocessingml/2006/main" w:val="hybridMultilevel"/>
@@ -7336,6 +8386,9 @@
       </w:rPr>
     </w:lvl>
   </w:abstractNum>
+  <w:num w:numId="49">
+    <w:abstractNumId w:val="41"/>
+  </w:num>
   <w:num w:numId="48">
     <w:abstractNumId w:val="40"/>
   </w:num>

</xml_diff>